<commit_message>
docs: Add final version for response to the committee.
The final documents to be submitted to the grading committee are attached:
1. "carta_respuesta_jurado.docx": Formal letter explaining how the comments were addressed
2. "Trabajo Final John Montoya.pdf": Final document of the master’s thesis
3. "Trabajo Final John Montoya - Observaciones jurado.pdf": Copy of the final document, with comments to help the jury easily navigate to the responses provided to the 20 comments.
</commit_message>
<xml_diff>
--- a/reports/carta_respuesta_jurado.docx
+++ b/reports/carta_respuesta_jurado.docx
@@ -71,7 +71,6 @@
         <w:t xml:space="preserve"> L.) en Colombia: Un enfoque basado en la huella espectral y la inteligencia artificial.</w:t>
       </w:r>
     </w:p>
-    <w:p/>
     <w:p>
       <w:pPr>
         <w:pStyle w:val="Prrafodelista"/>
@@ -206,7 +205,69 @@
         <w:jc w:val="both"/>
       </w:pPr>
       <w:r>
-        <w:t xml:space="preserve">En la </w:t>
+        <w:t>Como respuesta a las observaciones realizadas por el jurado se entregan los siguientes artefactos:</w:t>
+      </w:r>
+    </w:p>
+    <w:p>
+      <w:pPr>
+        <w:pStyle w:val="Prrafodelista"/>
+        <w:numPr>
+          <w:ilvl w:val="0"/>
+          <w:numId w:val="22"/>
+        </w:numPr>
+        <w:jc w:val="both"/>
+      </w:pPr>
+      <w:r>
+        <w:t>Documento “</w:t>
+      </w:r>
+      <w:r>
+        <w:t>Trabajo Final John Montoya</w:t>
+      </w:r>
+      <w:r>
+        <w:t>.pdf”: Documento corregido en limpio y final correspondiente al trabajo de grado.</w:t>
+      </w:r>
+    </w:p>
+    <w:p>
+      <w:pPr>
+        <w:pStyle w:val="Prrafodelista"/>
+        <w:numPr>
+          <w:ilvl w:val="0"/>
+          <w:numId w:val="22"/>
+        </w:numPr>
+        <w:jc w:val="both"/>
+      </w:pPr>
+      <w:r>
+        <w:t>Carta de respuesta al jurado: Esta misma carta, que contiene las indicaciones de la respuesta hacia las observaciones del jurado.</w:t>
+      </w:r>
+    </w:p>
+    <w:p>
+      <w:pPr>
+        <w:pStyle w:val="Prrafodelista"/>
+        <w:numPr>
+          <w:ilvl w:val="0"/>
+          <w:numId w:val="22"/>
+        </w:numPr>
+        <w:jc w:val="both"/>
+      </w:pPr>
+      <w:r>
+        <w:t>Copia del documento final, llamado “</w:t>
+      </w:r>
+      <w:r>
+        <w:t>Trabajo Final John Montoya - Observaciones jurado</w:t>
+      </w:r>
+      <w:r>
+        <w:t>.pdf”: Es una copia del documento final y contiene comentarios para que el jurado pueda verificar fácilmente las secciones y párrafos que dan respuesta a las 20 observaciones iniciales.</w:t>
+      </w:r>
+    </w:p>
+    <w:p>
+      <w:pPr>
+        <w:jc w:val="both"/>
+      </w:pPr>
+      <w:r>
+        <w:t xml:space="preserve">Además, dentro de este documento se presenta </w:t>
+      </w:r>
+      <w:r>
+        <w:t xml:space="preserve">la </w:t>
       </w:r>
       <w:r>
         <w:rPr>
@@ -216,7 +277,10 @@
         <w:t>Tabla 1</w:t>
       </w:r>
       <w:r>
-        <w:t xml:space="preserve"> se encuentra cada una de las observaciones con un nombre corto </w:t>
+        <w:t>, donde se</w:t>
+      </w:r>
+      <w:r>
+        <w:t xml:space="preserve"> encuentra cada una de las observaciones con un nombre corto </w:t>
       </w:r>
       <w:r>
         <w:rPr>
@@ -318,7 +382,15 @@
           <w:b/>
           <w:bCs/>
         </w:rPr>
-        <w:t>sin nuevos entrenamientos ni modificaciones de los modelos previamente registrados</w:t>
+        <w:t xml:space="preserve">sin nuevos </w:t>
+      </w:r>
+      <w:r>
+        <w:rPr>
+          <w:b/>
+          <w:bCs/>
+        </w:rPr>
+        <w:lastRenderedPageBreak/>
+        <w:t>entrenamientos ni modificaciones de los modelos previamente registrados</w:t>
       </w:r>
       <w:r>
         <w:t>.</w:t>
@@ -365,7 +437,6 @@
           <w:sz w:val="28"/>
           <w:szCs w:val="28"/>
         </w:rPr>
-        <w:lastRenderedPageBreak/>
         <w:t>Tabla</w:t>
       </w:r>
       <w:r>
@@ -395,10 +466,10 @@
       </w:tblPr>
       <w:tblGrid>
         <w:gridCol w:w="481"/>
-        <w:gridCol w:w="3860"/>
+        <w:gridCol w:w="3598"/>
         <w:gridCol w:w="1503"/>
         <w:gridCol w:w="1199"/>
-        <w:gridCol w:w="1785"/>
+        <w:gridCol w:w="2047"/>
       </w:tblGrid>
       <w:tr>
         <w:tc>
@@ -737,7 +808,22 @@
               <w:spacing w:after="160" w:line="278" w:lineRule="auto"/>
             </w:pPr>
             <w:r>
-              <w:t>1.2 y 2.2</w:t>
+              <w:t>1.2</w:t>
+            </w:r>
+            <w:r>
+              <w:t xml:space="preserve"> (p. 23)</w:t>
+            </w:r>
+            <w:r>
+              <w:t xml:space="preserve"> y 2.2</w:t>
+            </w:r>
+            <w:r>
+              <w:t xml:space="preserve"> (p</w:t>
+            </w:r>
+            <w:r>
+              <w:t xml:space="preserve">. </w:t>
+            </w:r>
+            <w:r>
+              <w:t>33)</w:t>
             </w:r>
           </w:p>
         </w:tc>
@@ -815,6 +901,12 @@
             <w:r>
               <w:t>4.1</w:t>
             </w:r>
+            <w:r>
+              <w:t xml:space="preserve"> </w:t>
+            </w:r>
+            <w:r>
+              <w:t>(pp. 86–88)</w:t>
+            </w:r>
           </w:p>
         </w:tc>
       </w:tr>
@@ -891,6 +983,12 @@
             <w:r>
               <w:t>4.1</w:t>
             </w:r>
+            <w:r>
+              <w:t xml:space="preserve"> </w:t>
+            </w:r>
+            <w:r>
+              <w:t>(pp. 86–88)</w:t>
+            </w:r>
           </w:p>
         </w:tc>
       </w:tr>
@@ -967,6 +1065,24 @@
             <w:r>
               <w:t>3.3</w:t>
             </w:r>
+            <w:r>
+              <w:t xml:space="preserve"> </w:t>
+            </w:r>
+            <w:r>
+              <w:t>(pp. 6</w:t>
+            </w:r>
+            <w:r>
+              <w:t>4</w:t>
+            </w:r>
+            <w:r>
+              <w:t>–6</w:t>
+            </w:r>
+            <w:r>
+              <w:t>5</w:t>
+            </w:r>
+            <w:r>
+              <w:t>)</w:t>
+            </w:r>
           </w:p>
         </w:tc>
       </w:tr>
@@ -1043,6 +1159,12 @@
             <w:r>
               <w:t>3.4.2.2</w:t>
             </w:r>
+            <w:r>
+              <w:t xml:space="preserve"> </w:t>
+            </w:r>
+            <w:r>
+              <w:t>(p. 70)</w:t>
+            </w:r>
           </w:p>
         </w:tc>
       </w:tr>
@@ -1119,6 +1241,12 @@
             <w:r>
               <w:t>3.1.2</w:t>
             </w:r>
+            <w:r>
+              <w:t xml:space="preserve"> </w:t>
+            </w:r>
+            <w:r>
+              <w:t>(pp. 57–58)</w:t>
+            </w:r>
           </w:p>
         </w:tc>
       </w:tr>
@@ -1195,6 +1323,12 @@
             <w:r>
               <w:t>3.4.3.1</w:t>
             </w:r>
+            <w:r>
+              <w:t xml:space="preserve"> </w:t>
+            </w:r>
+            <w:r>
+              <w:t>(pp. 74–75)</w:t>
+            </w:r>
           </w:p>
         </w:tc>
       </w:tr>
@@ -1271,6 +1405,12 @@
             <w:r>
               <w:t>4.3.1</w:t>
             </w:r>
+            <w:r>
+              <w:t xml:space="preserve"> </w:t>
+            </w:r>
+            <w:r>
+              <w:t>(pp. 92–93)</w:t>
+            </w:r>
           </w:p>
         </w:tc>
       </w:tr>
@@ -1285,6 +1425,7 @@
               <w:spacing w:after="160" w:line="278" w:lineRule="auto"/>
             </w:pPr>
             <w:r>
+              <w:lastRenderedPageBreak/>
               <w:t>11</w:t>
             </w:r>
           </w:p>
@@ -1350,7 +1491,19 @@
               <w:spacing w:after="160" w:line="278" w:lineRule="auto"/>
             </w:pPr>
             <w:r>
-              <w:t>4.4</w:t>
+              <w:t>4.</w:t>
+            </w:r>
+            <w:r>
+              <w:t xml:space="preserve">3.4 </w:t>
+            </w:r>
+            <w:r>
+              <w:t>(p. 103)</w:t>
+            </w:r>
+            <w:r>
+              <w:t xml:space="preserve"> y 4.4 </w:t>
+            </w:r>
+            <w:r>
+              <w:t>(pp. 111–112)</w:t>
             </w:r>
           </w:p>
         </w:tc>
@@ -1428,6 +1581,12 @@
             <w:r>
               <w:t>4.6</w:t>
             </w:r>
+            <w:r>
+              <w:t xml:space="preserve"> </w:t>
+            </w:r>
+            <w:r>
+              <w:t>(pp. 125–126)</w:t>
+            </w:r>
           </w:p>
         </w:tc>
       </w:tr>
@@ -1504,6 +1663,12 @@
             <w:r>
               <w:t>4.6</w:t>
             </w:r>
+            <w:r>
+              <w:t xml:space="preserve"> </w:t>
+            </w:r>
+            <w:r>
+              <w:t>(pp. 126–127)</w:t>
+            </w:r>
           </w:p>
         </w:tc>
       </w:tr>
@@ -1580,6 +1745,12 @@
             <w:r>
               <w:t>5.1</w:t>
             </w:r>
+            <w:r>
+              <w:t xml:space="preserve"> </w:t>
+            </w:r>
+            <w:r>
+              <w:t>(pp. 129–133)</w:t>
+            </w:r>
           </w:p>
         </w:tc>
       </w:tr>
@@ -1594,7 +1765,6 @@
               <w:spacing w:after="160" w:line="278" w:lineRule="auto"/>
             </w:pPr>
             <w:r>
-              <w:lastRenderedPageBreak/>
               <w:t>15</w:t>
             </w:r>
           </w:p>
@@ -1657,6 +1827,12 @@
             <w:r>
               <w:t>5.2</w:t>
             </w:r>
+            <w:r>
+              <w:t xml:space="preserve"> </w:t>
+            </w:r>
+            <w:r>
+              <w:t>(p. 134)</w:t>
+            </w:r>
           </w:p>
         </w:tc>
       </w:tr>
@@ -1731,7 +1907,13 @@
               <w:spacing w:after="160" w:line="278" w:lineRule="auto"/>
             </w:pPr>
             <w:r>
-              <w:t>4.3.4.3</w:t>
+              <w:t>4.3.5</w:t>
+            </w:r>
+            <w:r>
+              <w:t xml:space="preserve"> </w:t>
+            </w:r>
+            <w:r>
+              <w:t>(pp. 104–105)</w:t>
             </w:r>
           </w:p>
         </w:tc>
@@ -1807,7 +1989,16 @@
               <w:spacing w:after="160" w:line="278" w:lineRule="auto"/>
             </w:pPr>
             <w:r>
-              <w:t>4.3.5</w:t>
+              <w:t>4.3.</w:t>
+            </w:r>
+            <w:r>
+              <w:t>6</w:t>
+            </w:r>
+            <w:r>
+              <w:t xml:space="preserve"> </w:t>
+            </w:r>
+            <w:r>
+              <w:t>(pp. 106–109)</w:t>
             </w:r>
           </w:p>
         </w:tc>
@@ -1885,6 +2076,12 @@
             <w:r>
               <w:t>4.4.1</w:t>
             </w:r>
+            <w:r>
+              <w:t xml:space="preserve"> </w:t>
+            </w:r>
+            <w:r>
+              <w:t>(pp. 113–115)</w:t>
+            </w:r>
           </w:p>
         </w:tc>
       </w:tr>
@@ -1961,6 +2158,12 @@
             <w:r>
               <w:t>3.1.1</w:t>
             </w:r>
+            <w:r>
+              <w:t xml:space="preserve"> </w:t>
+            </w:r>
+            <w:r>
+              <w:t>(p. 56)</w:t>
+            </w:r>
           </w:p>
         </w:tc>
       </w:tr>
@@ -2036,6 +2239,12 @@
             </w:pPr>
             <w:r>
               <w:t>4.5</w:t>
+            </w:r>
+            <w:r>
+              <w:t xml:space="preserve"> </w:t>
+            </w:r>
+            <w:r>
+              <w:t>(pp. 116–122)</w:t>
             </w:r>
           </w:p>
         </w:tc>
@@ -2232,7 +2441,15 @@
                 <w:i/>
                 <w:iCs/>
               </w:rPr>
-              <w:t>"Se observa una redundancia informativa respecto al concepto de imágenes hiperespectrales en al menos tres secciones, por lo que se recomienda unificar esta definición en una única presentación."</w:t>
+              <w:t xml:space="preserve">"Se observa una redundancia informativa respecto al concepto de imágenes hiperespectrales en al menos tres secciones, por lo que se recomienda </w:t>
+            </w:r>
+            <w:r>
+              <w:rPr>
+                <w:i/>
+                <w:iCs/>
+              </w:rPr>
+              <w:lastRenderedPageBreak/>
+              <w:t>unificar esta definición en una única presentación."</w:t>
             </w:r>
           </w:p>
         </w:tc>
@@ -2244,6 +2461,7 @@
           </w:tcPr>
           <w:p>
             <w:r>
+              <w:lastRenderedPageBreak/>
               <w:t>4</w:t>
             </w:r>
           </w:p>
@@ -2294,7 +2512,6 @@
           </w:tcPr>
           <w:p>
             <w:r>
-              <w:lastRenderedPageBreak/>
               <w:t>5</w:t>
             </w:r>
           </w:p>
@@ -2528,6 +2745,7 @@
           </w:tcPr>
           <w:p>
             <w:r>
+              <w:lastRenderedPageBreak/>
               <w:t>11</w:t>
             </w:r>
           </w:p>
@@ -2681,15 +2899,7 @@
                 <w:i/>
                 <w:iCs/>
               </w:rPr>
-              <w:t xml:space="preserve">"se recomienda reestructurar las conclusiones para evidenciar el </w:t>
-            </w:r>
-            <w:r>
-              <w:rPr>
-                <w:i/>
-                <w:iCs/>
-              </w:rPr>
-              <w:lastRenderedPageBreak/>
-              <w:t>cumplimiento de cada objetivo específico. Se deben abordar las limitaciones, la justificación de la clasificación binaria frente al desbalance de clases y si contemplo solo comp</w:t>
+              <w:t>"se recomienda reestructurar las conclusiones para evidenciar el cumplimiento de cada objetivo específico. Se deben abordar las limitaciones, la justificación de la clasificación binaria frente al desbalance de clases y si contemplo solo comp</w:t>
             </w:r>
             <w:r>
               <w:rPr>
@@ -2715,7 +2925,6 @@
           </w:tcPr>
           <w:p>
             <w:r>
-              <w:lastRenderedPageBreak/>
               <w:t>15</w:t>
             </w:r>
           </w:p>
@@ -2791,6 +3000,7 @@
           </w:tcPr>
           <w:p>
             <w:r>
+              <w:lastRenderedPageBreak/>
               <w:t>17</w:t>
             </w:r>
           </w:p>
@@ -2879,7 +3089,6 @@
           </w:tcPr>
           <w:p>
             <w:r>
-              <w:lastRenderedPageBreak/>
               <w:t>19</w:t>
             </w:r>
           </w:p>
@@ -4547,6 +4756,95 @@
     </w:lvl>
   </w:abstractNum>
   <w:abstractNum w:abstractNumId="10" w15:restartNumberingAfterBreak="0">
+    <w:nsid w:val="2F9779BD"/>
+    <w:multiLevelType w:val="hybridMultilevel"/>
+    <w:tmpl w:val="61E02DD0"/>
+    <w:lvl w:ilvl="0" w:tplc="240A000F">
+      <w:start w:val="1"/>
+      <w:numFmt w:val="decimal"/>
+      <w:lvlText w:val="%1."/>
+      <w:lvlJc w:val="left"/>
+      <w:pPr>
+        <w:ind w:left="720" w:hanging="360"/>
+      </w:pPr>
+      <w:rPr>
+        <w:rFonts w:hint="default"/>
+      </w:rPr>
+    </w:lvl>
+    <w:lvl w:ilvl="1" w:tplc="240A0019" w:tentative="1">
+      <w:start w:val="1"/>
+      <w:numFmt w:val="lowerLetter"/>
+      <w:lvlText w:val="%2."/>
+      <w:lvlJc w:val="left"/>
+      <w:pPr>
+        <w:ind w:left="1440" w:hanging="360"/>
+      </w:pPr>
+    </w:lvl>
+    <w:lvl w:ilvl="2" w:tplc="240A001B" w:tentative="1">
+      <w:start w:val="1"/>
+      <w:numFmt w:val="lowerRoman"/>
+      <w:lvlText w:val="%3."/>
+      <w:lvlJc w:val="right"/>
+      <w:pPr>
+        <w:ind w:left="2160" w:hanging="180"/>
+      </w:pPr>
+    </w:lvl>
+    <w:lvl w:ilvl="3" w:tplc="240A000F" w:tentative="1">
+      <w:start w:val="1"/>
+      <w:numFmt w:val="decimal"/>
+      <w:lvlText w:val="%4."/>
+      <w:lvlJc w:val="left"/>
+      <w:pPr>
+        <w:ind w:left="2880" w:hanging="360"/>
+      </w:pPr>
+    </w:lvl>
+    <w:lvl w:ilvl="4" w:tplc="240A0019" w:tentative="1">
+      <w:start w:val="1"/>
+      <w:numFmt w:val="lowerLetter"/>
+      <w:lvlText w:val="%5."/>
+      <w:lvlJc w:val="left"/>
+      <w:pPr>
+        <w:ind w:left="3600" w:hanging="360"/>
+      </w:pPr>
+    </w:lvl>
+    <w:lvl w:ilvl="5" w:tplc="240A001B" w:tentative="1">
+      <w:start w:val="1"/>
+      <w:numFmt w:val="lowerRoman"/>
+      <w:lvlText w:val="%6."/>
+      <w:lvlJc w:val="right"/>
+      <w:pPr>
+        <w:ind w:left="4320" w:hanging="180"/>
+      </w:pPr>
+    </w:lvl>
+    <w:lvl w:ilvl="6" w:tplc="240A000F" w:tentative="1">
+      <w:start w:val="1"/>
+      <w:numFmt w:val="decimal"/>
+      <w:lvlText w:val="%7."/>
+      <w:lvlJc w:val="left"/>
+      <w:pPr>
+        <w:ind w:left="5040" w:hanging="360"/>
+      </w:pPr>
+    </w:lvl>
+    <w:lvl w:ilvl="7" w:tplc="240A0019" w:tentative="1">
+      <w:start w:val="1"/>
+      <w:numFmt w:val="lowerLetter"/>
+      <w:lvlText w:val="%8."/>
+      <w:lvlJc w:val="left"/>
+      <w:pPr>
+        <w:ind w:left="5760" w:hanging="360"/>
+      </w:pPr>
+    </w:lvl>
+    <w:lvl w:ilvl="8" w:tplc="240A001B" w:tentative="1">
+      <w:start w:val="1"/>
+      <w:numFmt w:val="lowerRoman"/>
+      <w:lvlText w:val="%9."/>
+      <w:lvlJc w:val="right"/>
+      <w:pPr>
+        <w:ind w:left="6480" w:hanging="180"/>
+      </w:pPr>
+    </w:lvl>
+  </w:abstractNum>
+  <w:abstractNum w:abstractNumId="11" w15:restartNumberingAfterBreak="0">
     <w:nsid w:val="31BD6CB1"/>
     <w:multiLevelType w:val="hybridMultilevel"/>
     <w:tmpl w:val="1C8C9A76"/>
@@ -4659,7 +4957,7 @@
       </w:rPr>
     </w:lvl>
   </w:abstractNum>
-  <w:abstractNum w:abstractNumId="11" w15:restartNumberingAfterBreak="0">
+  <w:abstractNum w:abstractNumId="12" w15:restartNumberingAfterBreak="0">
     <w:nsid w:val="3B8D57B0"/>
     <w:multiLevelType w:val="hybridMultilevel"/>
     <w:tmpl w:val="4ABA2774"/>
@@ -4772,7 +5070,7 @@
       </w:rPr>
     </w:lvl>
   </w:abstractNum>
-  <w:abstractNum w:abstractNumId="12" w15:restartNumberingAfterBreak="0">
+  <w:abstractNum w:abstractNumId="13" w15:restartNumberingAfterBreak="0">
     <w:nsid w:val="3C41435E"/>
     <w:multiLevelType w:val="hybridMultilevel"/>
     <w:tmpl w:val="358241F6"/>
@@ -4885,7 +5183,7 @@
       </w:rPr>
     </w:lvl>
   </w:abstractNum>
-  <w:abstractNum w:abstractNumId="13" w15:restartNumberingAfterBreak="0">
+  <w:abstractNum w:abstractNumId="14" w15:restartNumberingAfterBreak="0">
     <w:nsid w:val="47746B46"/>
     <w:multiLevelType w:val="hybridMultilevel"/>
     <w:tmpl w:val="C1DA785A"/>
@@ -4998,7 +5296,7 @@
       </w:rPr>
     </w:lvl>
   </w:abstractNum>
-  <w:abstractNum w:abstractNumId="14" w15:restartNumberingAfterBreak="0">
+  <w:abstractNum w:abstractNumId="15" w15:restartNumberingAfterBreak="0">
     <w:nsid w:val="58201A7F"/>
     <w:multiLevelType w:val="hybridMultilevel"/>
     <w:tmpl w:val="9FAC10BE"/>
@@ -5112,7 +5410,7 @@
       </w:rPr>
     </w:lvl>
   </w:abstractNum>
-  <w:abstractNum w:abstractNumId="15" w15:restartNumberingAfterBreak="0">
+  <w:abstractNum w:abstractNumId="16" w15:restartNumberingAfterBreak="0">
     <w:nsid w:val="5E06470C"/>
     <w:multiLevelType w:val="hybridMultilevel"/>
     <w:tmpl w:val="72F6DA10"/>
@@ -5225,7 +5523,7 @@
       </w:rPr>
     </w:lvl>
   </w:abstractNum>
-  <w:abstractNum w:abstractNumId="16" w15:restartNumberingAfterBreak="0">
+  <w:abstractNum w:abstractNumId="17" w15:restartNumberingAfterBreak="0">
     <w:nsid w:val="60C24E8F"/>
     <w:multiLevelType w:val="hybridMultilevel"/>
     <w:tmpl w:val="D7568B02"/>
@@ -5338,7 +5636,7 @@
       </w:rPr>
     </w:lvl>
   </w:abstractNum>
-  <w:abstractNum w:abstractNumId="17" w15:restartNumberingAfterBreak="0">
+  <w:abstractNum w:abstractNumId="18" w15:restartNumberingAfterBreak="0">
     <w:nsid w:val="6F21231A"/>
     <w:multiLevelType w:val="hybridMultilevel"/>
     <w:tmpl w:val="085E5AF0"/>
@@ -5451,7 +5749,7 @@
       </w:rPr>
     </w:lvl>
   </w:abstractNum>
-  <w:abstractNum w:abstractNumId="18" w15:restartNumberingAfterBreak="0">
+  <w:abstractNum w:abstractNumId="19" w15:restartNumberingAfterBreak="0">
     <w:nsid w:val="72C65A66"/>
     <w:multiLevelType w:val="hybridMultilevel"/>
     <w:tmpl w:val="6F826D7E"/>
@@ -5564,7 +5862,7 @@
       </w:rPr>
     </w:lvl>
   </w:abstractNum>
-  <w:abstractNum w:abstractNumId="19" w15:restartNumberingAfterBreak="0">
+  <w:abstractNum w:abstractNumId="20" w15:restartNumberingAfterBreak="0">
     <w:nsid w:val="73AA21E6"/>
     <w:multiLevelType w:val="hybridMultilevel"/>
     <w:tmpl w:val="527E2766"/>
@@ -5677,7 +5975,7 @@
       </w:rPr>
     </w:lvl>
   </w:abstractNum>
-  <w:abstractNum w:abstractNumId="20" w15:restartNumberingAfterBreak="0">
+  <w:abstractNum w:abstractNumId="21" w15:restartNumberingAfterBreak="0">
     <w:nsid w:val="7AAD01A1"/>
     <w:multiLevelType w:val="hybridMultilevel"/>
     <w:tmpl w:val="7D70A4EE"/>
@@ -5791,7 +6089,7 @@
     </w:lvl>
   </w:abstractNum>
   <w:num w:numId="1" w16cid:durableId="853614174">
-    <w:abstractNumId w:val="14"/>
+    <w:abstractNumId w:val="15"/>
   </w:num>
   <w:num w:numId="2" w16cid:durableId="276571244">
     <w:abstractNumId w:val="3"/>
@@ -5803,7 +6101,7 @@
     <w:abstractNumId w:val="8"/>
   </w:num>
   <w:num w:numId="5" w16cid:durableId="1187644497">
-    <w:abstractNumId w:val="13"/>
+    <w:abstractNumId w:val="14"/>
   </w:num>
   <w:num w:numId="6" w16cid:durableId="689916926">
     <w:abstractNumId w:val="1"/>
@@ -5812,46 +6110,49 @@
     <w:abstractNumId w:val="9"/>
   </w:num>
   <w:num w:numId="8" w16cid:durableId="149295032">
-    <w:abstractNumId w:val="17"/>
+    <w:abstractNumId w:val="18"/>
   </w:num>
   <w:num w:numId="9" w16cid:durableId="800727777">
-    <w:abstractNumId w:val="12"/>
+    <w:abstractNumId w:val="13"/>
   </w:num>
   <w:num w:numId="10" w16cid:durableId="196554432">
-    <w:abstractNumId w:val="10"/>
+    <w:abstractNumId w:val="11"/>
   </w:num>
   <w:num w:numId="11" w16cid:durableId="1011689724">
     <w:abstractNumId w:val="4"/>
   </w:num>
   <w:num w:numId="12" w16cid:durableId="1716154958">
+    <w:abstractNumId w:val="21"/>
+  </w:num>
+  <w:num w:numId="13" w16cid:durableId="1889881199">
     <w:abstractNumId w:val="20"/>
   </w:num>
-  <w:num w:numId="13" w16cid:durableId="1889881199">
-    <w:abstractNumId w:val="19"/>
-  </w:num>
   <w:num w:numId="14" w16cid:durableId="2121678894">
-    <w:abstractNumId w:val="15"/>
+    <w:abstractNumId w:val="16"/>
   </w:num>
   <w:num w:numId="15" w16cid:durableId="737364052">
     <w:abstractNumId w:val="6"/>
   </w:num>
   <w:num w:numId="16" w16cid:durableId="1903130167">
-    <w:abstractNumId w:val="18"/>
+    <w:abstractNumId w:val="19"/>
   </w:num>
   <w:num w:numId="17" w16cid:durableId="2145847688">
-    <w:abstractNumId w:val="16"/>
+    <w:abstractNumId w:val="17"/>
   </w:num>
   <w:num w:numId="18" w16cid:durableId="1998143822">
     <w:abstractNumId w:val="0"/>
   </w:num>
   <w:num w:numId="19" w16cid:durableId="2099666250">
-    <w:abstractNumId w:val="11"/>
+    <w:abstractNumId w:val="12"/>
   </w:num>
   <w:num w:numId="20" w16cid:durableId="562378415">
     <w:abstractNumId w:val="2"/>
   </w:num>
   <w:num w:numId="21" w16cid:durableId="1486358865">
     <w:abstractNumId w:val="5"/>
+  </w:num>
+  <w:num w:numId="22" w16cid:durableId="866066915">
+    <w:abstractNumId w:val="10"/>
   </w:num>
 </w:numbering>
 </file>
@@ -6459,7 +6760,6 @@
   <w:style w:type="character" w:default="1" w:styleId="Fuentedeprrafopredeter">
     <w:name w:val="Default Paragraph Font"/>
     <w:uiPriority w:val="1"/>
-    <w:semiHidden/>
     <w:unhideWhenUsed/>
   </w:style>
   <w:style w:type="table" w:default="1" w:styleId="Tablanormal">

</xml_diff>